<commit_message>
Remove working note from manuscript draft
Co-Authored-By: Claude Sonnet 5.5 <noreply@anthropic.com>
Claude-Session: https://claude.ai/code/session_01EgyYKg5xmvfWgoXE7s255Z
</commit_message>
<xml_diff>
--- a/jmis/jmis_draft_v3.docx
+++ b/jmis/jmis_draft_v3.docx
@@ -14,19 +14,6 @@
       <w:r>
         <w:rPr/>
         <w:t>Deference or Noise? Separating Stance Sensitivity from Instability in AI Reviewers and What It Costs</w:t>
-      </w:r>
-    </w:p>
-    <w:p>
-      <w:pPr>
-        <w:pStyle w:val="FirstParagraph"/>
-        <w:rPr/>
-      </w:pPr>
-      <w:r>
-        <w:rPr>
-          <w:i/>
-          <w:iCs/>
-        </w:rPr>
-        <w:t>Working draft for the Journal of Management Information Systems. Sections 1–5 (introduction, literature, theory, hypotheses, method) are written. Sections 6–8 are skeletons: every number marked [PENDING] needs data that has not been collected. References marked † were added in this draft and must be checked against the source (title, venue, pages) before submission. JMIS is double-blind: remove author-identifying text and self-references before submitting, and keep the abstract at or below 150 words.</w:t>
       </w:r>
     </w:p>
     <w:p>

</xml_diff>

<commit_message>
Remove dagger marks and the added-references header from manuscript
Co-Authored-By: Claude Sonnet 5.5 <noreply@anthropic.com>
Claude-Session: https://claude.ai/code/session_01EgyYKg5xmvfWgoXE7s255Z
</commit_message>
<xml_diff>
--- a/jmis/jmis_draft_v3.docx
+++ b/jmis/jmis_draft_v3.docx
@@ -206,7 +206,7 @@
       </w:pPr>
       <w:r>
         <w:rPr/>
-        <w:t>The failure that worries practitioners and researchers is that the AI agrees. Models trained on human approval tend to endorse a stated view more often than the evidence warrants (Perez et al. 2022; Sharma et al. 2023), and challenging a correct answer can make a model abandon it (Laban et al. 2023†). That reading is natural, and it is already familiar. It is also not yet a measurement. When a model’s answer changes after a user states a view, at least four different things could have happened:</w:t>
+        <w:t>The failure that worries practitioners and researchers is that the AI agrees. Models trained on human approval tend to endorse a stated view more often than the evidence warrants (Perez et al. 2022; Sharma et al. 2023), and challenging a correct answer can make a model abandon it (Laban et al. 2023). That reading is natural, and it is already familiar. It is also not yet a measurement. When a model’s answer changes after a user states a view, at least four different things could have happened:</w:t>
       </w:r>
     </w:p>
     <w:p>
@@ -248,7 +248,7 @@
       </w:r>
       <w:r>
         <w:rPr/>
-        <w:t xml:space="preserve"> Any additional sentence, relevant or not, shifts the answer (Sclar et al. 2024†).</w:t>
+        <w:t xml:space="preserve"> Any additional sentence, relevant or not, shifts the answer (Sclar et al. 2024).</w:t>
       </w:r>
     </w:p>
     <w:p>
@@ -439,7 +439,7 @@
       <w:bookmarkStart w:id="9" w:name="X6c0b28d343ae8e5e551e5653c4bd6842a3510c9"/>
       <w:r>
         <w:rPr/>
-        <w:t>Information systems research on delegation to and from agentic artifacts (Baird and Maruping 2021) and on the cognitive challenges of delegating to AI (Fügener et al. 2022) concerns how people decide what to hand over and whether they rely on the result. The behavioral literature on reliance describes both under-reliance on algorithms (Dietvorst et al. 2015†) and over-reliance (Logg et al. 2019†; Parasuraman and Riley 1997†), and the trust literature stresses that reliance should track actual reliability (Lee and See 2004†). In the economics of AI, Agrawal et al. (2019) separate prediction from judgment and argue that the value of prediction depends on the complementary judgment of the human; we study a case in which the AI’s own judgment is moved by the human’s stated view. A buyer choosing among reviewers typically sees only stance-free benchmark accuracy, which is a measure of ability, and the sociotechnical view of IS (Sarker et al. 2019) suggests that this is exactly the kind of cue that misleads when a property of the social setting, here the visible preference of the requester, matters. Supervisory guidance on model risk management requires validation that provides effective challenge (Board of Governors of the Federal Reserve System 2011), which is the property a deferential reviewer lacks.</w:t>
+        <w:t>Information systems research on delegation to and from agentic artifacts (Baird and Maruping 2021) and on the cognitive challenges of delegating to AI (Fügener et al. 2022) concerns how people decide what to hand over and whether they rely on the result. The behavioral literature on reliance describes both under-reliance on algorithms (Dietvorst et al. 2015) and over-reliance (Logg et al. 2019; Parasuraman and Riley 1997), and the trust literature stresses that reliance should track actual reliability (Lee and See 2004). In the economics of AI, Agrawal et al. (2019) separate prediction from judgment and argue that the value of prediction depends on the complementary judgment of the human; we study a case in which the AI’s own judgment is moved by the human’s stated view. A buyer choosing among reviewers typically sees only stance-free benchmark accuracy, which is a measure of ability, and the sociotechnical view of IS (Sarker et al. 2019) suggests that this is exactly the kind of cue that misleads when a property of the social setting, here the visible preference of the requester, matters. Supervisory guidance on model risk management requires validation that provides effective challenge (Board of Governors of the Federal Reserve System 2011), which is the property a deferential reviewer lacks.</w:t>
       </w:r>
       <w:bookmarkEnd w:id="9"/>
     </w:p>
@@ -462,7 +462,7 @@
       <w:bookmarkStart w:id="11" w:name="X19e466756fa2c40adf37a5bbea87ddef6503a6b"/>
       <w:r>
         <w:rPr/>
-        <w:t>The computer-science literature documents sycophancy in models trained with human feedback (Ouyang et al. 2022; Perez et al. 2022; Sharma et al. 2023) and finds it can be reduced by targeted data (Wei et al. 2023†). It also documents three phenomena that the sycophancy label can absorb. First, answers vary across runs even when settings are meant to be deterministic (Atil et al. 2024†). Second, outputs change with trivial changes to a prompt (Sclar et al. 2024†) and with the position of the correct option (Zheng et al. 2024†). Third, stated views can bias answers without the model acknowledging them (Turpin et al. 2023†), which is evidence of influence but not of its mechanism. Scaling studies (Kaplan et al. 2020; Hoffmann et al. 2022) concern capability, and larger models are more able, but whether larger models defer less is an empirical question that earlier tests answer in the opposite direction in some settings (Perez et al. 2022).</w:t>
+        <w:t>The computer-science literature documents sycophancy in models trained with human feedback (Ouyang et al. 2022; Perez et al. 2022; Sharma et al. 2023) and finds it can be reduced by targeted data (Wei et al. 2023). It also documents three phenomena that the sycophancy label can absorb. First, answers vary across runs even when settings are meant to be deterministic (Atil et al. 2024). Second, outputs change with trivial changes to a prompt (Sclar et al. 2024) and with the position of the correct option (Zheng et al. 2024). Third, stated views can bias answers without the model acknowledging them (Turpin et al. 2023), which is evidence of influence but not of its mechanism. Scaling studies (Kaplan et al. 2020; Hoffmann et al. 2022) concern capability, and larger models are more able, but whether larger models defer less is an empirical question that earlier tests answer in the opposite direction in some settings (Perez et al. 2022).</w:t>
       </w:r>
       <w:bookmarkEnd w:id="11"/>
     </w:p>
@@ -3510,27 +3510,17 @@
       </w:pPr>
       <w:r>
         <w:rPr/>
-        <w:t>Added in this draft (†), details to be checked:</w:t>
-      </w:r>
-    </w:p>
-    <w:p>
-      <w:pPr>
-        <w:pStyle w:val="BodyText"/>
-        <w:rPr/>
-      </w:pPr>
-      <w:r>
-        <w:rPr/>
-        <w:t xml:space="preserve">† Atil B, et al. (2024) Non-determinism of “deterministic” LLM settings. Preprint, arXiv:2408.04667.</w:t>
-      </w:r>
-    </w:p>
-    <w:p>
-      <w:pPr>
-        <w:pStyle w:val="BodyText"/>
-        <w:rPr/>
-      </w:pPr>
-      <w:r>
-        <w:rPr/>
-        <w:t xml:space="preserve">† Dietvorst BJ, Simmons JP, Massey C (2015) Algorithm aversion: People erroneously avoid algorithms after seeing them err. </w:t>
+        <w:t xml:space="preserve">Atil B, et al. (2024) Non-determinism of “deterministic” LLM settings. Preprint, arXiv:2408.04667.</w:t>
+      </w:r>
+    </w:p>
+    <w:p>
+      <w:pPr>
+        <w:pStyle w:val="BodyText"/>
+        <w:rPr/>
+      </w:pPr>
+      <w:r>
+        <w:rPr/>
+        <w:t xml:space="preserve">Dietvorst BJ, Simmons JP, Massey C (2015) Algorithm aversion: People erroneously avoid algorithms after seeing them err. </w:t>
       </w:r>
       <w:r>
         <w:rPr>
@@ -3551,17 +3541,17 @@
       </w:pPr>
       <w:r>
         <w:rPr/>
-        <w:t xml:space="preserve">† Laban P, Murakhovs’ka L, Xiong C, Wu CS (2023) Are you sure? Challenging LLMs leads to performance drops in the FlipFlop experiment. Preprint, arXiv:2311.08596.</w:t>
-      </w:r>
-    </w:p>
-    <w:p>
-      <w:pPr>
-        <w:pStyle w:val="BodyText"/>
-        <w:rPr/>
-      </w:pPr>
-      <w:r>
-        <w:rPr/>
-        <w:t xml:space="preserve">† Lee JD, See KA (2004) Trust in automation: Designing for appropriate reliance. </w:t>
+        <w:t xml:space="preserve">Laban P, Murakhovs’ka L, Xiong C, Wu CS (2023) Are you sure? Challenging LLMs leads to performance drops in the FlipFlop experiment. Preprint, arXiv:2311.08596.</w:t>
+      </w:r>
+    </w:p>
+    <w:p>
+      <w:pPr>
+        <w:pStyle w:val="BodyText"/>
+        <w:rPr/>
+      </w:pPr>
+      <w:r>
+        <w:rPr/>
+        <w:t xml:space="preserve">Lee JD, See KA (2004) Trust in automation: Designing for appropriate reliance. </w:t>
       </w:r>
       <w:r>
         <w:rPr>
@@ -3582,7 +3572,7 @@
       </w:pPr>
       <w:r>
         <w:rPr/>
-        <w:t xml:space="preserve">† Logg JM, Minson JA, Moore DA (2019) Algorithm appreciation: People prefer algorithmic to human judgment. </w:t>
+        <w:t xml:space="preserve">Logg JM, Minson JA, Moore DA (2019) Algorithm appreciation: People prefer algorithmic to human judgment. </w:t>
       </w:r>
       <w:r>
         <w:rPr>
@@ -3603,7 +3593,7 @@
       </w:pPr>
       <w:r>
         <w:rPr/>
-        <w:t xml:space="preserve">† Parasuraman R, Riley V (1997) Humans and automation: Use, misuse, disuse, abuse. </w:t>
+        <w:t xml:space="preserve">Parasuraman R, Riley V (1997) Humans and automation: Use, misuse, disuse, abuse. </w:t>
       </w:r>
       <w:r>
         <w:rPr>
@@ -3624,7 +3614,7 @@
       </w:pPr>
       <w:r>
         <w:rPr/>
-        <w:t xml:space="preserve">† Sclar M, Choi Y, Tsvetkov Y, Suhr A (2024) Quantifying language models’ sensitivity to spurious features in prompt design. </w:t>
+        <w:t xml:space="preserve">Sclar M, Choi Y, Tsvetkov Y, Suhr A (2024) Quantifying language models’ sensitivity to spurious features in prompt design. </w:t>
       </w:r>
       <w:r>
         <w:rPr>
@@ -3645,7 +3635,7 @@
       </w:pPr>
       <w:r>
         <w:rPr/>
-        <w:t xml:space="preserve">† Turpin M, Michael J, Perez E, Bowman SR (2023) Language models don’t always say what they think: Unfaithful explanations in chain-of-thought prompting. </w:t>
+        <w:t xml:space="preserve">Turpin M, Michael J, Perez E, Bowman SR (2023) Language models don’t always say what they think: Unfaithful explanations in chain-of-thought prompting. </w:t>
       </w:r>
       <w:r>
         <w:rPr>
@@ -3666,7 +3656,7 @@
       </w:pPr>
       <w:r>
         <w:rPr/>
-        <w:t xml:space="preserve">† Wei J, Huang D, Lu Y, Zhou D, Le QV (2023) Simple synthetic data reduces sycophancy in large language models. Preprint, arXiv:2308.03958.</w:t>
+        <w:t xml:space="preserve">Wei J, Huang D, Lu Y, Zhou D, Le QV (2023) Simple synthetic data reduces sycophancy in large language models. Preprint, arXiv:2308.03958.</w:t>
       </w:r>
     </w:p>
     <w:p>
@@ -3677,7 +3667,7 @@
       </w:pPr>
       <w:r>
         <w:rPr/>
-        <w:t xml:space="preserve">† Zheng C, Zhou H, Meng F, Zhou J, Huang M (2024) Large language models are not robust multiple choice selectors. </w:t>
+        <w:t xml:space="preserve">Zheng C, Zhou H, Meng F, Zhou J, Huang M (2024) Large language models are not robust multiple choice selectors. </w:t>
       </w:r>
       <w:r>
         <w:rPr>

</xml_diff>

<commit_message>
Add decision rules for H1, H2, H4, H5 to manuscript
Co-Authored-By: Claude Sonnet 5.5 <noreply@anthropic.com>
Claude-Session: https://claude.ai/code/session_01EgyYKg5xmvfWgoXE7s255Z
</commit_message>
<xml_diff>
--- a/jmis/jmis_draft_v3.docx
+++ b/jmis/jmis_draft_v3.docx
@@ -1352,7 +1352,7 @@
       </w:r>
       <w:r>
         <w:rPr/>
-        <w:t xml:space="preserve"> The conventionally measured conditional deference exceeds the corrected effect, f(e*) &gt; s*, because ρ &gt; 0. The share removed is largest for small, unstable models.</w:t>
+        <w:t xml:space="preserve"> The conventionally measured conditional deference exceeds the corrected effect, f(e*) &gt; s*, because ρ &gt; 0. The share removed is largest for small, unstable models. H1 is supported for a model if the interval for ρ excludes 0, and overall if it does so for a majority of models; the clause on small, unstable models is supported if the rank correlation between ν and the share removed is positive with an interval excluding 0.</w:t>
       </w:r>
     </w:p>
     <w:p>
@@ -1369,7 +1369,7 @@
       </w:r>
       <w:r>
         <w:rPr/>
-        <w:t xml:space="preserve"> Within each family the larger model has higher ability and a lower corrected stance effect s*. H2 asks whether this pattern survives correction.</w:t>
+        <w:t xml:space="preserve"> Within each family the larger model has higher ability and a lower corrected stance effect s*. H2 asks whether this pattern survives correction. H2 is supported in a family if the paired interval for the large-minus-small difference excludes 0 in the stated direction for both ability and s*; across families we report an exact two-sided sign test and its smallest attainable p value, and make no general claim about scale.</w:t>
       </w:r>
     </w:p>
     <w:p>
@@ -1465,7 +1465,7 @@
       </w:r>
       <w:r>
         <w:rPr/>
-        <w:t>) &lt; 0, so the closed form with measured conditional deference understates the model-free value of review (Proposition 5).</w:t>
+        <w:t>) &lt; 0, so the closed form with measured conditional deference understates the model-free value of review (Proposition 5). H4 is supported if the interval for the covariance lies below 0 and the model-free value of review exceeds the closed form at π = .7.</w:t>
       </w:r>
     </w:p>
     <w:p>
@@ -1482,7 +1482,7 @@
       </w:r>
       <w:r>
         <w:rPr/>
-        <w:t xml:space="preserve"> Ranking models by stance-free ability preserves the order of value in most pairs but overstates the level by the factor 1/(1 − s*), where s* now replaces the uncorrected conditional deference.</w:t>
+        <w:t xml:space="preserve"> Ranking models by stance-free ability preserves the order of value in most pairs but overstates the level by the factor 1/(1 − s*), where s* now replaces the uncorrected conditional deference. H5 is supported if the share of model pairs in which ranking by ability is value-optimal at both endpoints of π exceeds .5 with an interval excluding .5; we also report rank correlations, the regret from ranking by ability, and the overstatement.</w:t>
       </w:r>
     </w:p>
     <w:p>

</xml_diff>

<commit_message>
Move H1-H5 decision rules into Table 1 in the manuscript
Co-Authored-By: Claude Sonnet 5.5 <noreply@anthropic.com>
Claude-Session: https://claude.ai/code/session_01EgyYKg5xmvfWgoXE7s255Z
</commit_message>
<xml_diff>
--- a/jmis/jmis_draft_v3.docx
+++ b/jmis/jmis_draft_v3.docx
@@ -1335,7 +1335,7 @@
       </w:pPr>
       <w:r>
         <w:rPr/>
-        <w:t>Let ν be the rate at which a stance-free replicate answers the stance-endorsed option among stems answered correctly in a reference run; ρ the same rate after a length-matched neutral sentence; f(e) the rate under a stance at claimed-evidence level e; and s* = f(e*) − ρ the baseline-corrected stance effect at the primary level e*, the stated preference without claimed evidence. All are shares of the same conditional set of stems.</w:t>
+        <w:t>Let ν be the rate at which a stance-free replicate answers the stance-endorsed option among stems answered correctly in a reference run; ρ the same rate after a length-matched neutral sentence; f(e) the rate under a stance at claimed-evidence level e; and s* = f(e*) − ρ the baseline-corrected stance effect at the primary level e*, the stated preference without claimed evidence. All are shares of the same conditional set of stems. Table 1 gives the decision rule for each hypothesis.</w:t>
       </w:r>
     </w:p>
     <w:p>
@@ -1352,7 +1352,7 @@
       </w:r>
       <w:r>
         <w:rPr/>
-        <w:t xml:space="preserve"> The conventionally measured conditional deference exceeds the corrected effect, f(e*) &gt; s*, because ρ &gt; 0. The share removed is largest for small, unstable models. H1 is supported for a model if the interval for ρ excludes 0, and overall if it does so for a majority of models; the clause on small, unstable models is supported if the rank correlation between ν and the share removed is positive with an interval excluding 0.</w:t>
+        <w:t xml:space="preserve"> The conventionally measured conditional deference exceeds the corrected effect, f(e*) &gt; s*, because ρ &gt; 0. The share removed is largest for small, unstable models.</w:t>
       </w:r>
     </w:p>
     <w:p>
@@ -1369,7 +1369,7 @@
       </w:r>
       <w:r>
         <w:rPr/>
-        <w:t xml:space="preserve"> Within each family the larger model has higher ability and a lower corrected stance effect s*. H2 asks whether this pattern survives correction. H2 is supported in a family if the paired interval for the large-minus-small difference excludes 0 in the stated direction for both ability and s*; across families we report an exact two-sided sign test and its smallest attainable p value, and make no general claim about scale.</w:t>
+        <w:t xml:space="preserve"> Within each family the larger model has higher ability and a lower corrected stance effect s*. H2 asks whether this pattern survives correction.</w:t>
       </w:r>
     </w:p>
     <w:p>
@@ -1428,7 +1428,7 @@
       </w:r>
       <w:r>
         <w:rPr/>
-        <w:t xml:space="preserve"> f(e) rises with e, rises with the disclosed accuracy, and falls under the disclaimer. We register both predictions and report the slopes, without a directional hypothesis about which account describes which model. A model is classified as deference-consistent when the intervals for the evidence slope, the accuracy slope and the disclaimer effect all include 0 and the evidence-slope interval lies within ±0.08 per level; as evidence-weighing-consistent when the evidence slope and the accuracy slope are positive and the disclaimer effect is negative, all with intervals excluding 0; and otherwise as mixed or unclassified. The margin of ±0.08 was set from simulated interval widths.</w:t>
+        <w:t xml:space="preserve"> f(e) rises with e, rises with the disclosed accuracy, and falls under the disclaimer. We register both predictions and report the slopes, without a directional hypothesis about which account describes which model.</w:t>
       </w:r>
     </w:p>
     <w:p>
@@ -1465,7 +1465,7 @@
       </w:r>
       <w:r>
         <w:rPr/>
-        <w:t>) &lt; 0, so the closed form with measured conditional deference understates the model-free value of review (Proposition 5). H4 is supported if the interval for the covariance lies below 0 and the model-free value of review exceeds the closed form at π = .7.</w:t>
+        <w:t>) &lt; 0, so the closed form with measured conditional deference understates the model-free value of review (Proposition 5).</w:t>
       </w:r>
     </w:p>
     <w:p>
@@ -1482,7 +1482,404 @@
       </w:r>
       <w:r>
         <w:rPr/>
-        <w:t xml:space="preserve"> Ranking models by stance-free ability preserves the order of value in most pairs but overstates the level by the factor 1/(1 − s*), where s* now replaces the uncorrected conditional deference. H5 is supported if the share of model pairs in which ranking by ability is value-optimal at both endpoints of π exceeds .5 with an interval excluding .5; we also report rank correlations, the regret from ranking by ability, and the overstatement.</w:t>
+        <w:t xml:space="preserve"> Ranking models by stance-free ability preserves the order of value in most pairs but overstates the level by the factor 1/(1 − s*), where s* now replaces the uncorrected conditional deference.</w:t>
+      </w:r>
+    </w:p>
+    <w:p>
+      <w:pPr>
+        <w:pStyle w:val="TableCaption"/>
+        <w:keepNext/>
+      </w:pPr>
+      <w:r>
+        <w:rPr>
+          <w:b/>
+          <w:bCs/>
+        </w:rPr>
+        <w:t xml:space="preserve">Table 1. </w:t>
+      </w:r>
+      <w:r>
+        <w:t xml:space="preserve">Decision rules for H1–H5</w:t>
+      </w:r>
+    </w:p>
+    <w:tbl>
+      <w:tblPr>
+        <w:tblW w:w="9360" w:type="dxa"/>
+        <w:tblLayout w:type="fixed"/>
+        <w:tblCellMar>
+          <w:left w:w="80" w:type="dxa"/>
+          <w:right w:w="80" w:type="dxa"/>
+        </w:tblCellMar>
+      </w:tblPr>
+      <w:tblGrid>
+        <w:gridCol w:w="1300"/>
+        <w:gridCol w:w="2700"/>
+        <w:gridCol w:w="5360"/>
+      </w:tblGrid>
+      <w:tr>
+        <w:trPr>
+          <w:cantSplit/>
+          <w:tblHeader/>
+        </w:trPr>
+        <w:tc>
+          <w:tcPr>
+            <w:tcW w:w="1300" w:type="dxa"/>
+            <w:tcBorders>
+              <w:top w:val="single" w:sz="8" w:space="0" w:color="000000"/>
+              <w:bottom w:val="single" w:sz="4" w:space="0" w:color="000000"/>
+            </w:tcBorders>
+          </w:tcPr>
+          <w:p>
+            <w:pPr>
+              <w:pStyle w:val="Compact"/>
+              <w:spacing w:before="40" w:after="40"/>
+            </w:pPr>
+            <w:r>
+              <w:rPr>
+                <w:b/>
+                <w:bCs/>
+              </w:rPr>
+              <w:t xml:space="preserve">Hypothesis</w:t>
+            </w:r>
+          </w:p>
+        </w:tc>
+        <w:tc>
+          <w:tcPr>
+            <w:tcW w:w="2700" w:type="dxa"/>
+            <w:tcBorders>
+              <w:top w:val="single" w:sz="8" w:space="0" w:color="000000"/>
+              <w:bottom w:val="single" w:sz="4" w:space="0" w:color="000000"/>
+            </w:tcBorders>
+          </w:tcPr>
+          <w:p>
+            <w:pPr>
+              <w:pStyle w:val="Compact"/>
+              <w:spacing w:before="40" w:after="40"/>
+            </w:pPr>
+            <w:r>
+              <w:rPr>
+                <w:b/>
+                <w:bCs/>
+              </w:rPr>
+              <w:t xml:space="preserve">Quantity</w:t>
+            </w:r>
+          </w:p>
+        </w:tc>
+        <w:tc>
+          <w:tcPr>
+            <w:tcW w:w="5360" w:type="dxa"/>
+            <w:tcBorders>
+              <w:top w:val="single" w:sz="8" w:space="0" w:color="000000"/>
+              <w:bottom w:val="single" w:sz="4" w:space="0" w:color="000000"/>
+            </w:tcBorders>
+          </w:tcPr>
+          <w:p>
+            <w:pPr>
+              <w:pStyle w:val="Compact"/>
+              <w:spacing w:before="40" w:after="40"/>
+            </w:pPr>
+            <w:r>
+              <w:rPr>
+                <w:b/>
+                <w:bCs/>
+              </w:rPr>
+              <w:t xml:space="preserve">Supported if</w:t>
+            </w:r>
+          </w:p>
+        </w:tc>
+      </w:tr>
+      <w:tr>
+        <w:trPr>
+          <w:cantSplit/>
+        </w:trPr>
+        <w:tc>
+          <w:tcPr>
+            <w:tcW w:w="1300" w:type="dxa"/>
+          </w:tcPr>
+          <w:p>
+            <w:pPr>
+              <w:pStyle w:val="Compact"/>
+              <w:spacing w:before="40" w:after="40"/>
+            </w:pPr>
+            <w:r>
+              <w:rPr>
+                <w:b/>
+                <w:bCs/>
+              </w:rPr>
+              <w:t xml:space="preserve">H1</w:t>
+            </w:r>
+          </w:p>
+        </w:tc>
+        <w:tc>
+          <w:tcPr>
+            <w:tcW w:w="2700" w:type="dxa"/>
+          </w:tcPr>
+          <w:p>
+            <w:pPr>
+              <w:pStyle w:val="Compact"/>
+              <w:spacing w:before="40" w:after="40"/>
+            </w:pPr>
+            <w:r>
+              <w:t xml:space="preserve">ρ; rank correlation of ν with the share removed</w:t>
+            </w:r>
+          </w:p>
+        </w:tc>
+        <w:tc>
+          <w:tcPr>
+            <w:tcW w:w="5360" w:type="dxa"/>
+          </w:tcPr>
+          <w:p>
+            <w:pPr>
+              <w:pStyle w:val="Compact"/>
+              <w:spacing w:before="40" w:after="40"/>
+            </w:pPr>
+            <w:r>
+              <w:t xml:space="preserve">Supported for a model if the interval for ρ excludes 0, and overall if it does so for a majority of models. The clause on small, unstable models is supported if the rank correlation is positive with an interval excluding 0.</w:t>
+            </w:r>
+          </w:p>
+        </w:tc>
+      </w:tr>
+      <w:tr>
+        <w:trPr>
+          <w:cantSplit/>
+        </w:trPr>
+        <w:tc>
+          <w:tcPr>
+            <w:tcW w:w="1300" w:type="dxa"/>
+          </w:tcPr>
+          <w:p>
+            <w:pPr>
+              <w:pStyle w:val="Compact"/>
+              <w:spacing w:before="40" w:after="40"/>
+            </w:pPr>
+            <w:r>
+              <w:rPr>
+                <w:b/>
+                <w:bCs/>
+              </w:rPr>
+              <w:t xml:space="preserve">H2</w:t>
+            </w:r>
+          </w:p>
+        </w:tc>
+        <w:tc>
+          <w:tcPr>
+            <w:tcW w:w="2700" w:type="dxa"/>
+          </w:tcPr>
+          <w:p>
+            <w:pPr>
+              <w:pStyle w:val="Compact"/>
+              <w:spacing w:before="40" w:after="40"/>
+            </w:pPr>
+            <w:r>
+              <w:t xml:space="preserve">Large minus small within a family: ability and s*</w:t>
+            </w:r>
+          </w:p>
+        </w:tc>
+        <w:tc>
+          <w:tcPr>
+            <w:tcW w:w="5360" w:type="dxa"/>
+          </w:tcPr>
+          <w:p>
+            <w:pPr>
+              <w:pStyle w:val="Compact"/>
+              <w:spacing w:before="40" w:after="40"/>
+            </w:pPr>
+            <w:r>
+              <w:t xml:space="preserve">Supported in a family if the paired interval excludes 0 in the stated direction for both (higher ability, lower s*). Across families: exact two-sided sign test and its smallest attainable p value; no general claim about scale.</w:t>
+            </w:r>
+          </w:p>
+        </w:tc>
+      </w:tr>
+      <w:tr>
+        <w:trPr>
+          <w:cantSplit/>
+        </w:trPr>
+        <w:tc>
+          <w:tcPr>
+            <w:tcW w:w="1300" w:type="dxa"/>
+          </w:tcPr>
+          <w:p>
+            <w:pPr>
+              <w:pStyle w:val="Compact"/>
+              <w:spacing w:before="40" w:after="40"/>
+            </w:pPr>
+            <w:r>
+              <w:rPr>
+                <w:b/>
+                <w:bCs/>
+              </w:rPr>
+              <w:t xml:space="preserve">H3</w:t>
+            </w:r>
+          </w:p>
+        </w:tc>
+        <w:tc>
+          <w:tcPr>
+            <w:tcW w:w="2700" w:type="dxa"/>
+          </w:tcPr>
+          <w:p>
+            <w:pPr>
+              <w:pStyle w:val="Compact"/>
+              <w:spacing w:before="40" w:after="40"/>
+            </w:pPr>
+            <w:r>
+              <w:t xml:space="preserve">Evidence slope, accuracy slope, disclaimer effect</w:t>
+            </w:r>
+          </w:p>
+        </w:tc>
+        <w:tc>
+          <w:tcPr>
+            <w:tcW w:w="5360" w:type="dxa"/>
+          </w:tcPr>
+          <w:p>
+            <w:pPr>
+              <w:pStyle w:val="Compact"/>
+              <w:spacing w:before="40" w:after="40"/>
+            </w:pPr>
+            <w:r>
+              <w:t xml:space="preserve">Deference-consistent: all three intervals include 0 and the evidence-slope interval lies within ±0.08 per level. Evidence-weighing-consistent: evidence slope &gt; 0, accuracy slope &gt; 0 and disclaimer effect &lt; 0, all intervals excluding 0. Otherwise mixed or unclassified.</w:t>
+            </w:r>
+          </w:p>
+        </w:tc>
+      </w:tr>
+      <w:tr>
+        <w:trPr>
+          <w:cantSplit/>
+        </w:trPr>
+        <w:tc>
+          <w:tcPr>
+            <w:tcW w:w="1300" w:type="dxa"/>
+          </w:tcPr>
+          <w:p>
+            <w:pPr>
+              <w:pStyle w:val="Compact"/>
+              <w:spacing w:before="40" w:after="40"/>
+            </w:pPr>
+            <w:r>
+              <w:rPr>
+                <w:b/>
+                <w:bCs/>
+              </w:rPr>
+              <w:t xml:space="preserve">H4</w:t>
+            </w:r>
+          </w:p>
+        </w:tc>
+        <w:tc>
+          <w:tcPr>
+            <w:tcW w:w="2700" w:type="dxa"/>
+          </w:tcPr>
+          <w:p>
+            <w:pPr>
+              <w:pStyle w:val="Compact"/>
+              <w:spacing w:before="40" w:after="40"/>
+            </w:pPr>
+            <w:r>
+              <w:t xml:space="preserve">Cov(a</w:t>
+            </w:r>
+            <w:r>
+              <w:rPr>
+                <w:vertAlign w:val="subscript"/>
+              </w:rPr>
+              <w:t xml:space="preserve">i</w:t>
+            </w:r>
+            <w:r>
+              <w:t xml:space="preserve">, s</w:t>
+            </w:r>
+            <w:r>
+              <w:rPr>
+                <w:vertAlign w:val="subscript"/>
+              </w:rPr>
+              <w:t xml:space="preserve">i</w:t>
+            </w:r>
+            <w:r>
+              <w:t xml:space="preserve">); model-free value minus closed form at π = .7</w:t>
+            </w:r>
+          </w:p>
+        </w:tc>
+        <w:tc>
+          <w:tcPr>
+            <w:tcW w:w="5360" w:type="dxa"/>
+          </w:tcPr>
+          <w:p>
+            <w:pPr>
+              <w:pStyle w:val="Compact"/>
+              <w:spacing w:before="40" w:after="40"/>
+            </w:pPr>
+            <w:r>
+              <w:t xml:space="preserve">Supported if the covariance interval lies below 0 and the model-free value exceeds the closed form.</w:t>
+            </w:r>
+          </w:p>
+        </w:tc>
+      </w:tr>
+      <w:tr>
+        <w:trPr>
+          <w:cantSplit/>
+        </w:trPr>
+        <w:tc>
+          <w:tcPr>
+            <w:tcW w:w="1300" w:type="dxa"/>
+            <w:tcBorders>
+              <w:bottom w:val="single" w:sz="8" w:space="0" w:color="000000"/>
+            </w:tcBorders>
+          </w:tcPr>
+          <w:p>
+            <w:pPr>
+              <w:pStyle w:val="Compact"/>
+              <w:spacing w:before="40" w:after="40"/>
+            </w:pPr>
+            <w:r>
+              <w:rPr>
+                <w:b/>
+                <w:bCs/>
+              </w:rPr>
+              <w:t xml:space="preserve">H5</w:t>
+            </w:r>
+          </w:p>
+        </w:tc>
+        <w:tc>
+          <w:tcPr>
+            <w:tcW w:w="2700" w:type="dxa"/>
+            <w:tcBorders>
+              <w:bottom w:val="single" w:sz="8" w:space="0" w:color="000000"/>
+            </w:tcBorders>
+          </w:tcPr>
+          <w:p>
+            <w:pPr>
+              <w:pStyle w:val="Compact"/>
+              <w:spacing w:before="40" w:after="40"/>
+            </w:pPr>
+            <w:r>
+              <w:t xml:space="preserve">Share of model pairs in which ranking by ability is value-optimal at both endpoints of π</w:t>
+            </w:r>
+          </w:p>
+        </w:tc>
+        <w:tc>
+          <w:tcPr>
+            <w:tcW w:w="5360" w:type="dxa"/>
+            <w:tcBorders>
+              <w:bottom w:val="single" w:sz="8" w:space="0" w:color="000000"/>
+            </w:tcBorders>
+          </w:tcPr>
+          <w:p>
+            <w:pPr>
+              <w:pStyle w:val="Compact"/>
+              <w:spacing w:before="40" w:after="40"/>
+            </w:pPr>
+            <w:r>
+              <w:t xml:space="preserve">Supported if the share exceeds .5 with an interval excluding .5. Rank correlations, the regret from ranking by ability and the overstatement are also reported.</w:t>
+            </w:r>
+          </w:p>
+        </w:tc>
+      </w:tr>
+    </w:tbl>
+    <w:p>
+      <w:pPr>
+        <w:pStyle w:val="BodyText"/>
+        <w:spacing w:before="60"/>
+      </w:pPr>
+      <w:r>
+        <w:rPr>
+          <w:sz w:val="20"/>
+        </w:rPr>
+        <w:t xml:space="preserve">Notes. All intervals are 95% percentile bootstrap intervals that resample stems (Section 5.4). The ±0.08 margin was set from simulated interval widths.</w:t>
       </w:r>
     </w:p>
     <w:p>

</xml_diff>

<commit_message>
Freeze analysis plan and bank without third-party registration; drop registration wording
Co-Authored-By: Claude Sonnet 5.5 <noreply@anthropic.com>
Claude-Session: https://claude.ai/code/session_01EgyYKg5xmvfWgoXE7s255Z
</commit_message>
<xml_diff>
--- a/jmis/jmis_draft_v3.docx
+++ b/jmis/jmis_draft_v3.docx
@@ -1428,7 +1428,7 @@
       </w:r>
       <w:r>
         <w:rPr/>
-        <w:t xml:space="preserve"> f(e) rises with e, rises with the disclosed accuracy, and falls under the disclaimer. We register both predictions and report the slopes, without a directional hypothesis about which account describes which model.</w:t>
+        <w:t xml:space="preserve"> f(e) rises with e, rises with the disclosed accuracy, and falls under the disclaimer. We state both predictions in advance and report the slopes, without a directional hypothesis about which account describes which model.</w:t>
       </w:r>
     </w:p>
     <w:p>
@@ -1985,7 +1985,7 @@
       <w:bookmarkStart w:id="26" w:name="items"/>
       <w:r>
         <w:rPr/>
-        <w:t>All arithmetic is exact. Each key was re-derived by a second program that parses the rendered stem, and the two agree on all items. Every stance sentence for every item was rendered and checked for grammar. Two independent human reviewers answered a random sample of 100 items, stratified by domain and difficulty tier, blind to the key. Both reviewers answered all 100 items as the key does (agreement with the key was 100% for each reviewer and between reviewers, Cohen’s kappa = 1.0), so no item was revised or removed. One reviewer noted that the rounding rule was not stated for values that are not exact cents; we added an explicit rounding sentence to the numeric items, and no key changed. Because the review covers a sample, the keys of the other items rest on the second-program check alone. The bank was frozen before the main run [PENDING: file hash and date].</w:t>
+        <w:t>All arithmetic is exact. Each key was re-derived by a second program that parses the rendered stem, and the two agree on all items. Every stance sentence for every item was rendered and checked for grammar. Two independent human reviewers answered a random sample of 100 items, stratified by domain and difficulty tier, blind to the key. Both reviewers answered all 100 items as the key does (agreement with the key was 100% for each reviewer and between reviewers, Cohen’s kappa = 1.0), so no item was revised or removed. One reviewer noted that the rounding rule was not stated for values that are not exact cents; we added an explicit rounding sentence to the numeric items, and no key changed. Because the review covers a sample, the keys of the other items rest on the second-program check alone. The bank was frozen before the main run (SHA-256 of the bank file c2f61e2721b525db…, frozen 22 October 2026).</w:t>
       </w:r>
       <w:bookmarkEnd w:id="26"/>
     </w:p>
@@ -2230,7 +2230,7 @@
       <w:bookmarkStart w:id="32" w:name="registration-and-deviations"/>
       <w:r>
         <w:rPr/>
-        <w:t>5.5 Registration and deviations</w:t>
+        <w:t>5.5 Analysis plan and deviations</w:t>
       </w:r>
     </w:p>
     <w:p>
@@ -2241,7 +2241,7 @@
       <w:bookmarkStart w:id="33" w:name="registration-and-deviations"/>
       <w:r>
         <w:rPr/>
-        <w:t>We registered the hypotheses, estimators, and decision rules on [PENDING: platform, date, anonymized link] before any model answered the frozen bank (SHA-256 [PENDING], frozen [PENDING: date]). The registration fixes the primary stance level e* (the stated preference without claimed evidence); the conditional set (stems the model answers correctly in replicate 0 of the stance-free channel); the corrected effect s* = f(e*) − ρ, with s_mix = (f(e*) − ρ)/(1 − ρ) as a registered sensitivity analysis; the treatment of unparseable answers (missing in the primary analysis, errors in the sensitivity analysis); the bootstrap (2,000 resamples of stems, shared across models); an equivalence margin of ±0.08 per evidence level for calling a flat gradient consistent with deference; the exclusion of a model from H1–H3 inference when fewer than 50 conditional stems remain; and the exclusion of models with stance-free accuracy of .98 or more from the rescue rate only. The token limit and answer parser for the three long-form commercial tiers were set from a 48-item stance-free pilot with items independent of the bank, and the parser is frozen with the bank. Departures from the registration are listed in a deviation log and are reported where they affect a result; analyses not in the registration are labelled exploratory. The bank is audited and reviewed before any model sees it so that no item is changed after a result is known.</w:t>
+        <w:t>We fixed the hypotheses, estimators, and decision rules before any model answered the frozen bank (SHA-256 c2f61e2721b525db…, frozen 22 October 2026). The plan is recorded in the project’s version-controlled repository; it was not registered with a third-party platform, so its timing rests on that record. The plan fixes the primary stance level e* (the stated preference without claimed evidence); the conditional set (stems the model answers correctly in replicate 0 of the stance-free channel); the corrected effect s* = f(e*) − ρ, with s_mix = (f(e*) − ρ)/(1 − ρ) as a sensitivity analysis; the treatment of unparseable answers (missing in the primary analysis, errors in the sensitivity analysis); the bootstrap (2,000 resamples of stems, shared across models); an equivalence margin of ±0.08 per evidence level for calling a flat gradient consistent with deference; the exclusion of a model from H1–H3 inference when fewer than 50 conditional stems remain; and the exclusion of models with stance-free accuracy of .98 or more from the rescue rate only. The token limit and answer parser for the three long-form commercial tiers were set from a 48-item stance-free pilot with items independent of the bank, and the parser is frozen with the bank. Departures from the plan are listed in a deviation log and are reported where they affect a result; analyses not in the plan are labelled exploratory. The bank is audited and reviewed before any model sees it so that no item is changed after a result is known.</w:t>
       </w:r>
       <w:bookmarkEnd w:id="33"/>
     </w:p>

</xml_diff>